<commit_message>
docs: finalize submission doc with student details, GitHub repo link, and generated PDF
</commit_message>
<xml_diff>
--- a/submission/ParthVerma_230953436_FGAI_Assignment2.docx
+++ b/submission/ParthVerma_230953436_FGAI_Assignment2.docx
@@ -12,7 +12,7 @@
           <w:color w:val="1A365D"/>
           <w:sz w:val="36"/>
         </w:rPr>
-        <w:t>Foundations of Generative AI (ICT4403) — Assignment 2</w:t>
+        <w:t>Foundations of Generative AI (ICT4403) - Assignment 2</w:t>
       </w:r>
     </w:p>
     <w:p>
@@ -84,7 +84,7 @@
               <w:rPr>
                 <w:sz w:val="20"/>
               </w:rPr>
-              <w:t>&lt;&lt;YourName&gt;&gt;</w:t>
+              <w:t>Parth Verma</w:t>
             </w:r>
           </w:p>
         </w:tc>
@@ -134,7 +134,7 @@
               <w:rPr>
                 <w:sz w:val="20"/>
               </w:rPr>
-              <w:t>&lt;&lt;RegNum&gt;&gt;</w:t>
+              <w:t>230953436</w:t>
             </w:r>
           </w:p>
         </w:tc>
@@ -184,7 +184,7 @@
               <w:rPr>
                 <w:sz w:val="20"/>
               </w:rPr>
-              <w:t>Foundations of Generative AI (ICT4403) — Assignment 2</w:t>
+              <w:t>Foundations of Generative AI (ICT4403) - Assignment 2</w:t>
             </w:r>
           </w:p>
         </w:tc>
@@ -232,7 +232,9 @@
             </w:pPr>
             <w:r>
               <w:rPr>
+                <w:color w:val="1D4ED8"/>
                 <w:sz w:val="20"/>
+                <w:u w:val="single"/>
               </w:rPr>
               <w:t>The Adventures of Sherlock Holmes (Project Gutenberg EBook #1661)</w:t>
               <w:br/>
@@ -284,9 +286,11 @@
             </w:pPr>
             <w:r>
               <w:rPr>
+                <w:color w:val="1D4ED8"/>
                 <w:sz w:val="20"/>
+                <w:u w:val="single"/>
               </w:rPr>
-              <w:t>&lt;&lt;GitHubLink or "TO BE ADDED"&gt;&gt;</w:t>
+              <w:t>https://github.com/NiftyRunner/fgai-autoregressive-textgen</w:t>
             </w:r>
           </w:p>
         </w:tc>

</xml_diff>